<commit_message>
Actualiza el material de la clase
</commit_message>
<xml_diff>
--- a/Clase 03/Actividad 2.docx
+++ b/Clase 03/Actividad 2.docx
@@ -312,6 +312,1099 @@
           <w:sz w:val="22"/>
           <w:szCs w:val="22"/>
         </w:rPr>
+        <w:t xml:space="preserve">Parte </w:t>
+      </w:r>
+      <w:r>
+        <w:rPr>
+          <w:b/>
+          <w:bCs/>
+          <w:sz w:val="22"/>
+          <w:szCs w:val="22"/>
+        </w:rPr>
+        <w:t>0</w:t>
+      </w:r>
+      <w:r>
+        <w:rPr>
+          <w:b/>
+          <w:bCs/>
+          <w:sz w:val="22"/>
+          <w:szCs w:val="22"/>
+        </w:rPr>
+        <w:t xml:space="preserve"> — </w:t>
+      </w:r>
+      <w:r>
+        <w:rPr>
+          <w:b/>
+          <w:bCs/>
+          <w:sz w:val="22"/>
+          <w:szCs w:val="22"/>
+        </w:rPr>
+        <w:t>Clonar repositorio (opcional</w:t>
+      </w:r>
+      <w:r>
+        <w:rPr>
+          <w:b/>
+          <w:bCs/>
+          <w:sz w:val="22"/>
+          <w:szCs w:val="22"/>
+        </w:rPr>
+        <w:t xml:space="preserve"> si no tiene si repositorio en la computadora</w:t>
+      </w:r>
+      <w:r>
+        <w:rPr>
+          <w:b/>
+          <w:bCs/>
+          <w:sz w:val="22"/>
+          <w:szCs w:val="22"/>
+        </w:rPr>
+        <w:t>)</w:t>
+      </w:r>
+    </w:p>
+    <w:p>
+      <w:pPr>
+        <w:pStyle w:val="Prrafodelista"/>
+        <w:numPr>
+          <w:ilvl w:val="0"/>
+          <w:numId w:val="20"/>
+        </w:numPr>
+        <w:spacing w:before="240" w:after="0"/>
+        <w:rPr>
+          <w:sz w:val="22"/>
+          <w:szCs w:val="22"/>
+        </w:rPr>
+      </w:pPr>
+      <w:r>
+        <w:rPr>
+          <w:sz w:val="22"/>
+          <w:szCs w:val="22"/>
+        </w:rPr>
+        <w:t>Abrir</w:t>
+      </w:r>
+      <w:r>
+        <w:rPr>
+          <w:sz w:val="22"/>
+          <w:szCs w:val="22"/>
+        </w:rPr>
+        <w:t xml:space="preserve"> el navegador e ingresar a GitHub:</w:t>
+      </w:r>
+      <w:r>
+        <w:rPr>
+          <w:sz w:val="22"/>
+          <w:szCs w:val="22"/>
+        </w:rPr>
+        <w:t xml:space="preserve"> </w:t>
+      </w:r>
+      <w:hyperlink r:id="rId7" w:history="1">
+        <w:r>
+          <w:rPr>
+            <w:rStyle w:val="Hipervnculo"/>
+            <w:sz w:val="22"/>
+            <w:szCs w:val="22"/>
+          </w:rPr>
+          <w:t>https://github.com</w:t>
+        </w:r>
+      </w:hyperlink>
+    </w:p>
+    <w:p>
+      <w:pPr>
+        <w:pStyle w:val="Prrafodelista"/>
+        <w:numPr>
+          <w:ilvl w:val="0"/>
+          <w:numId w:val="20"/>
+        </w:numPr>
+        <w:spacing w:before="240" w:after="0"/>
+        <w:rPr>
+          <w:sz w:val="22"/>
+          <w:szCs w:val="22"/>
+        </w:rPr>
+      </w:pPr>
+      <w:r>
+        <w:rPr>
+          <w:sz w:val="22"/>
+          <w:szCs w:val="22"/>
+        </w:rPr>
+        <w:t xml:space="preserve">Presionar </w:t>
+      </w:r>
+      <w:proofErr w:type="spellStart"/>
+      <w:r>
+        <w:rPr>
+          <w:b/>
+          <w:bCs/>
+          <w:sz w:val="22"/>
+          <w:szCs w:val="22"/>
+        </w:rPr>
+        <w:t>Sign</w:t>
+      </w:r>
+      <w:proofErr w:type="spellEnd"/>
+      <w:r>
+        <w:rPr>
+          <w:b/>
+          <w:bCs/>
+          <w:sz w:val="22"/>
+          <w:szCs w:val="22"/>
+        </w:rPr>
+        <w:t xml:space="preserve"> in</w:t>
+      </w:r>
+      <w:r>
+        <w:rPr>
+          <w:sz w:val="22"/>
+          <w:szCs w:val="22"/>
+        </w:rPr>
+        <w:t>.</w:t>
+      </w:r>
+      <w:r>
+        <w:rPr>
+          <w:sz w:val="22"/>
+          <w:szCs w:val="22"/>
+        </w:rPr>
+        <w:br/>
+      </w:r>
+      <w:r>
+        <w:rPr>
+          <w:sz w:val="22"/>
+          <w:szCs w:val="22"/>
+        </w:rPr>
+        <w:drawing>
+          <wp:inline distT="0" distB="0" distL="0" distR="0" wp14:anchorId="3FF2F080" wp14:editId="660124C8">
+            <wp:extent cx="4511431" cy="685859"/>
+            <wp:effectExtent l="0" t="0" r="3810" b="0"/>
+            <wp:docPr id="999287258" name="Imagen 1"/>
+            <wp:cNvGraphicFramePr>
+              <a:graphicFrameLocks xmlns:a="http://schemas.openxmlformats.org/drawingml/2006/main" noChangeAspect="1"/>
+            </wp:cNvGraphicFramePr>
+            <a:graphic xmlns:a="http://schemas.openxmlformats.org/drawingml/2006/main">
+              <a:graphicData uri="http://schemas.openxmlformats.org/drawingml/2006/picture">
+                <pic:pic xmlns:pic="http://schemas.openxmlformats.org/drawingml/2006/picture">
+                  <pic:nvPicPr>
+                    <pic:cNvPr id="999287258" name=""/>
+                    <pic:cNvPicPr/>
+                  </pic:nvPicPr>
+                  <pic:blipFill>
+                    <a:blip r:embed="rId8"/>
+                    <a:stretch>
+                      <a:fillRect/>
+                    </a:stretch>
+                  </pic:blipFill>
+                  <pic:spPr>
+                    <a:xfrm>
+                      <a:off x="0" y="0"/>
+                      <a:ext cx="4511431" cy="685859"/>
+                    </a:xfrm>
+                    <a:prstGeom prst="rect">
+                      <a:avLst/>
+                    </a:prstGeom>
+                  </pic:spPr>
+                </pic:pic>
+              </a:graphicData>
+            </a:graphic>
+          </wp:inline>
+        </w:drawing>
+      </w:r>
+    </w:p>
+    <w:p>
+      <w:pPr>
+        <w:pStyle w:val="Prrafodelista"/>
+        <w:numPr>
+          <w:ilvl w:val="0"/>
+          <w:numId w:val="20"/>
+        </w:numPr>
+        <w:spacing w:before="240" w:after="0"/>
+        <w:rPr>
+          <w:sz w:val="22"/>
+          <w:szCs w:val="22"/>
+        </w:rPr>
+      </w:pPr>
+      <w:r>
+        <w:rPr>
+          <w:sz w:val="22"/>
+          <w:szCs w:val="22"/>
+        </w:rPr>
+        <w:t>Iniciar sesión con su usuario y contraseña.</w:t>
+      </w:r>
+    </w:p>
+    <w:p>
+      <w:pPr>
+        <w:pStyle w:val="Prrafodelista"/>
+        <w:numPr>
+          <w:ilvl w:val="0"/>
+          <w:numId w:val="20"/>
+        </w:numPr>
+        <w:spacing w:before="240" w:after="0"/>
+        <w:rPr>
+          <w:sz w:val="22"/>
+          <w:szCs w:val="22"/>
+        </w:rPr>
+      </w:pPr>
+      <w:r>
+        <w:rPr>
+          <w:sz w:val="22"/>
+          <w:szCs w:val="22"/>
+        </w:rPr>
+        <w:t>Hacer clic en la foto de perfil ubicada en la esquina superior derecha.</w:t>
+      </w:r>
+    </w:p>
+    <w:p>
+      <w:pPr>
+        <w:pStyle w:val="Prrafodelista"/>
+        <w:numPr>
+          <w:ilvl w:val="0"/>
+          <w:numId w:val="20"/>
+        </w:numPr>
+        <w:spacing w:before="240" w:after="0"/>
+        <w:rPr>
+          <w:sz w:val="22"/>
+          <w:szCs w:val="22"/>
+        </w:rPr>
+      </w:pPr>
+      <w:r>
+        <w:rPr>
+          <w:sz w:val="22"/>
+          <w:szCs w:val="22"/>
+        </w:rPr>
+        <w:t xml:space="preserve">Seleccionar la opción </w:t>
+      </w:r>
+      <w:proofErr w:type="spellStart"/>
+      <w:r>
+        <w:rPr>
+          <w:b/>
+          <w:bCs/>
+          <w:sz w:val="22"/>
+          <w:szCs w:val="22"/>
+        </w:rPr>
+        <w:t>R</w:t>
+      </w:r>
+      <w:r>
+        <w:rPr>
+          <w:b/>
+          <w:bCs/>
+          <w:sz w:val="22"/>
+          <w:szCs w:val="22"/>
+        </w:rPr>
+        <w:t>epositories</w:t>
+      </w:r>
+      <w:proofErr w:type="spellEnd"/>
+      <w:r>
+        <w:rPr>
+          <w:sz w:val="22"/>
+          <w:szCs w:val="22"/>
+        </w:rPr>
+        <w:t>.</w:t>
+      </w:r>
+      <w:r>
+        <w:rPr>
+          <w:sz w:val="22"/>
+          <w:szCs w:val="22"/>
+        </w:rPr>
+        <w:br/>
+      </w:r>
+      <w:r>
+        <w:rPr>
+          <w:sz w:val="22"/>
+          <w:szCs w:val="22"/>
+        </w:rPr>
+        <w:drawing>
+          <wp:inline distT="0" distB="0" distL="0" distR="0" wp14:anchorId="08E5DC9A" wp14:editId="7FF487E0">
+            <wp:extent cx="1617133" cy="1511781"/>
+            <wp:effectExtent l="0" t="0" r="2540" b="0"/>
+            <wp:docPr id="2120694245" name="Imagen 1"/>
+            <wp:cNvGraphicFramePr>
+              <a:graphicFrameLocks xmlns:a="http://schemas.openxmlformats.org/drawingml/2006/main" noChangeAspect="1"/>
+            </wp:cNvGraphicFramePr>
+            <a:graphic xmlns:a="http://schemas.openxmlformats.org/drawingml/2006/main">
+              <a:graphicData uri="http://schemas.openxmlformats.org/drawingml/2006/picture">
+                <pic:pic xmlns:pic="http://schemas.openxmlformats.org/drawingml/2006/picture">
+                  <pic:nvPicPr>
+                    <pic:cNvPr id="2120694245" name=""/>
+                    <pic:cNvPicPr/>
+                  </pic:nvPicPr>
+                  <pic:blipFill>
+                    <a:blip r:embed="rId9"/>
+                    <a:stretch>
+                      <a:fillRect/>
+                    </a:stretch>
+                  </pic:blipFill>
+                  <pic:spPr>
+                    <a:xfrm>
+                      <a:off x="0" y="0"/>
+                      <a:ext cx="1630921" cy="1524671"/>
+                    </a:xfrm>
+                    <a:prstGeom prst="rect">
+                      <a:avLst/>
+                    </a:prstGeom>
+                  </pic:spPr>
+                </pic:pic>
+              </a:graphicData>
+            </a:graphic>
+          </wp:inline>
+        </w:drawing>
+      </w:r>
+    </w:p>
+    <w:p>
+      <w:pPr>
+        <w:pStyle w:val="Prrafodelista"/>
+        <w:numPr>
+          <w:ilvl w:val="0"/>
+          <w:numId w:val="20"/>
+        </w:numPr>
+        <w:spacing w:before="240" w:after="0"/>
+        <w:rPr>
+          <w:sz w:val="22"/>
+          <w:szCs w:val="22"/>
+        </w:rPr>
+      </w:pPr>
+      <w:r>
+        <w:rPr>
+          <w:sz w:val="22"/>
+          <w:szCs w:val="22"/>
+        </w:rPr>
+        <w:lastRenderedPageBreak/>
+        <w:t>Buscar y seleccionar el repositorio del curso</w:t>
+      </w:r>
+      <w:r>
+        <w:rPr>
+          <w:sz w:val="22"/>
+          <w:szCs w:val="22"/>
+        </w:rPr>
+        <w:t xml:space="preserve"> I-2026-</w:t>
+      </w:r>
+      <w:r>
+        <w:rPr>
+          <w:sz w:val="22"/>
+          <w:szCs w:val="22"/>
+        </w:rPr>
+        <w:t>Fundamentos-Python-&lt;Nombre&gt;</w:t>
+      </w:r>
+      <w:r>
+        <w:rPr>
+          <w:sz w:val="22"/>
+          <w:szCs w:val="22"/>
+        </w:rPr>
+        <w:t>.</w:t>
+      </w:r>
+      <w:r>
+        <w:rPr>
+          <w:sz w:val="22"/>
+          <w:szCs w:val="22"/>
+        </w:rPr>
+        <w:br/>
+      </w:r>
+      <w:r>
+        <w:rPr>
+          <w:sz w:val="22"/>
+          <w:szCs w:val="22"/>
+        </w:rPr>
+        <w:drawing>
+          <wp:inline distT="0" distB="0" distL="0" distR="0" wp14:anchorId="1D9436C1" wp14:editId="0BD15132">
+            <wp:extent cx="3471333" cy="1724170"/>
+            <wp:effectExtent l="0" t="0" r="0" b="0"/>
+            <wp:docPr id="980811773" name="Imagen 1"/>
+            <wp:cNvGraphicFramePr>
+              <a:graphicFrameLocks xmlns:a="http://schemas.openxmlformats.org/drawingml/2006/main" noChangeAspect="1"/>
+            </wp:cNvGraphicFramePr>
+            <a:graphic xmlns:a="http://schemas.openxmlformats.org/drawingml/2006/main">
+              <a:graphicData uri="http://schemas.openxmlformats.org/drawingml/2006/picture">
+                <pic:pic xmlns:pic="http://schemas.openxmlformats.org/drawingml/2006/picture">
+                  <pic:nvPicPr>
+                    <pic:cNvPr id="980811773" name=""/>
+                    <pic:cNvPicPr/>
+                  </pic:nvPicPr>
+                  <pic:blipFill>
+                    <a:blip r:embed="rId10"/>
+                    <a:stretch>
+                      <a:fillRect/>
+                    </a:stretch>
+                  </pic:blipFill>
+                  <pic:spPr>
+                    <a:xfrm>
+                      <a:off x="0" y="0"/>
+                      <a:ext cx="3486660" cy="1731783"/>
+                    </a:xfrm>
+                    <a:prstGeom prst="rect">
+                      <a:avLst/>
+                    </a:prstGeom>
+                  </pic:spPr>
+                </pic:pic>
+              </a:graphicData>
+            </a:graphic>
+          </wp:inline>
+        </w:drawing>
+      </w:r>
+    </w:p>
+    <w:p>
+      <w:pPr>
+        <w:pStyle w:val="Prrafodelista"/>
+        <w:numPr>
+          <w:ilvl w:val="0"/>
+          <w:numId w:val="20"/>
+        </w:numPr>
+        <w:spacing w:before="240" w:after="0"/>
+        <w:rPr>
+          <w:sz w:val="22"/>
+          <w:szCs w:val="22"/>
+        </w:rPr>
+      </w:pPr>
+      <w:r>
+        <w:rPr>
+          <w:sz w:val="22"/>
+          <w:szCs w:val="22"/>
+        </w:rPr>
+        <w:t>Dentro del repositorio, hacer clic en el botón verde llamado “Code”.</w:t>
+      </w:r>
+      <w:r>
+        <w:rPr>
+          <w:sz w:val="22"/>
+          <w:szCs w:val="22"/>
+        </w:rPr>
+        <w:br/>
+      </w:r>
+      <w:r>
+        <w:rPr>
+          <w:sz w:val="22"/>
+          <w:szCs w:val="22"/>
+        </w:rPr>
+        <w:drawing>
+          <wp:inline distT="0" distB="0" distL="0" distR="0" wp14:anchorId="529F0AF4" wp14:editId="3A740EBA">
+            <wp:extent cx="929721" cy="320068"/>
+            <wp:effectExtent l="0" t="0" r="3810" b="3810"/>
+            <wp:docPr id="1852841111" name="Imagen 1"/>
+            <wp:cNvGraphicFramePr>
+              <a:graphicFrameLocks xmlns:a="http://schemas.openxmlformats.org/drawingml/2006/main" noChangeAspect="1"/>
+            </wp:cNvGraphicFramePr>
+            <a:graphic xmlns:a="http://schemas.openxmlformats.org/drawingml/2006/main">
+              <a:graphicData uri="http://schemas.openxmlformats.org/drawingml/2006/picture">
+                <pic:pic xmlns:pic="http://schemas.openxmlformats.org/drawingml/2006/picture">
+                  <pic:nvPicPr>
+                    <pic:cNvPr id="1852841111" name=""/>
+                    <pic:cNvPicPr/>
+                  </pic:nvPicPr>
+                  <pic:blipFill>
+                    <a:blip r:embed="rId11"/>
+                    <a:stretch>
+                      <a:fillRect/>
+                    </a:stretch>
+                  </pic:blipFill>
+                  <pic:spPr>
+                    <a:xfrm>
+                      <a:off x="0" y="0"/>
+                      <a:ext cx="929721" cy="320068"/>
+                    </a:xfrm>
+                    <a:prstGeom prst="rect">
+                      <a:avLst/>
+                    </a:prstGeom>
+                  </pic:spPr>
+                </pic:pic>
+              </a:graphicData>
+            </a:graphic>
+          </wp:inline>
+        </w:drawing>
+      </w:r>
+    </w:p>
+    <w:p>
+      <w:pPr>
+        <w:pStyle w:val="Prrafodelista"/>
+        <w:numPr>
+          <w:ilvl w:val="0"/>
+          <w:numId w:val="20"/>
+        </w:numPr>
+        <w:spacing w:before="240" w:after="0"/>
+        <w:rPr>
+          <w:sz w:val="22"/>
+          <w:szCs w:val="22"/>
+        </w:rPr>
+      </w:pPr>
+      <w:r>
+        <w:rPr>
+          <w:sz w:val="22"/>
+          <w:szCs w:val="22"/>
+        </w:rPr>
+        <w:t>Verificar que esté seleccionada la opción HTTPS.</w:t>
+      </w:r>
+      <w:r>
+        <w:rPr>
+          <w:sz w:val="22"/>
+          <w:szCs w:val="22"/>
+        </w:rPr>
+        <w:br/>
+      </w:r>
+      <w:r>
+        <w:rPr>
+          <w:sz w:val="22"/>
+          <w:szCs w:val="22"/>
+        </w:rPr>
+        <w:drawing>
+          <wp:inline distT="0" distB="0" distL="0" distR="0" wp14:anchorId="0A0B2790" wp14:editId="68F97C60">
+            <wp:extent cx="1828958" cy="403895"/>
+            <wp:effectExtent l="0" t="0" r="0" b="0"/>
+            <wp:docPr id="1611715249" name="Imagen 1"/>
+            <wp:cNvGraphicFramePr>
+              <a:graphicFrameLocks xmlns:a="http://schemas.openxmlformats.org/drawingml/2006/main" noChangeAspect="1"/>
+            </wp:cNvGraphicFramePr>
+            <a:graphic xmlns:a="http://schemas.openxmlformats.org/drawingml/2006/main">
+              <a:graphicData uri="http://schemas.openxmlformats.org/drawingml/2006/picture">
+                <pic:pic xmlns:pic="http://schemas.openxmlformats.org/drawingml/2006/picture">
+                  <pic:nvPicPr>
+                    <pic:cNvPr id="1611715249" name=""/>
+                    <pic:cNvPicPr/>
+                  </pic:nvPicPr>
+                  <pic:blipFill>
+                    <a:blip r:embed="rId12"/>
+                    <a:stretch>
+                      <a:fillRect/>
+                    </a:stretch>
+                  </pic:blipFill>
+                  <pic:spPr>
+                    <a:xfrm>
+                      <a:off x="0" y="0"/>
+                      <a:ext cx="1828958" cy="403895"/>
+                    </a:xfrm>
+                    <a:prstGeom prst="rect">
+                      <a:avLst/>
+                    </a:prstGeom>
+                  </pic:spPr>
+                </pic:pic>
+              </a:graphicData>
+            </a:graphic>
+          </wp:inline>
+        </w:drawing>
+      </w:r>
+    </w:p>
+    <w:p>
+      <w:pPr>
+        <w:pStyle w:val="Prrafodelista"/>
+        <w:numPr>
+          <w:ilvl w:val="0"/>
+          <w:numId w:val="20"/>
+        </w:numPr>
+        <w:spacing w:before="240" w:after="0"/>
+        <w:rPr>
+          <w:sz w:val="22"/>
+          <w:szCs w:val="22"/>
+        </w:rPr>
+      </w:pPr>
+      <w:r>
+        <w:rPr>
+          <w:sz w:val="22"/>
+          <w:szCs w:val="22"/>
+        </w:rPr>
+        <w:t>Copiar la URL del repositorio.</w:t>
+      </w:r>
+      <w:r>
+        <w:rPr>
+          <w:sz w:val="22"/>
+          <w:szCs w:val="22"/>
+        </w:rPr>
+        <w:br/>
+      </w:r>
+      <w:r>
+        <w:rPr>
+          <w:sz w:val="22"/>
+          <w:szCs w:val="22"/>
+        </w:rPr>
+        <w:drawing>
+          <wp:inline distT="0" distB="0" distL="0" distR="0" wp14:anchorId="6CAD1050" wp14:editId="4657CCAA">
+            <wp:extent cx="3330229" cy="2110923"/>
+            <wp:effectExtent l="0" t="0" r="3810" b="3810"/>
+            <wp:docPr id="1984953492" name="Imagen 1"/>
+            <wp:cNvGraphicFramePr>
+              <a:graphicFrameLocks xmlns:a="http://schemas.openxmlformats.org/drawingml/2006/main" noChangeAspect="1"/>
+            </wp:cNvGraphicFramePr>
+            <a:graphic xmlns:a="http://schemas.openxmlformats.org/drawingml/2006/main">
+              <a:graphicData uri="http://schemas.openxmlformats.org/drawingml/2006/picture">
+                <pic:pic xmlns:pic="http://schemas.openxmlformats.org/drawingml/2006/picture">
+                  <pic:nvPicPr>
+                    <pic:cNvPr id="1984953492" name=""/>
+                    <pic:cNvPicPr/>
+                  </pic:nvPicPr>
+                  <pic:blipFill>
+                    <a:blip r:embed="rId13"/>
+                    <a:stretch>
+                      <a:fillRect/>
+                    </a:stretch>
+                  </pic:blipFill>
+                  <pic:spPr>
+                    <a:xfrm>
+                      <a:off x="0" y="0"/>
+                      <a:ext cx="3330229" cy="2110923"/>
+                    </a:xfrm>
+                    <a:prstGeom prst="rect">
+                      <a:avLst/>
+                    </a:prstGeom>
+                  </pic:spPr>
+                </pic:pic>
+              </a:graphicData>
+            </a:graphic>
+          </wp:inline>
+        </w:drawing>
+      </w:r>
+    </w:p>
+    <w:p>
+      <w:pPr>
+        <w:pStyle w:val="Prrafodelista"/>
+        <w:numPr>
+          <w:ilvl w:val="0"/>
+          <w:numId w:val="20"/>
+        </w:numPr>
+        <w:spacing w:before="240" w:after="0"/>
+        <w:rPr>
+          <w:sz w:val="22"/>
+          <w:szCs w:val="22"/>
+        </w:rPr>
+      </w:pPr>
+      <w:r>
+        <w:rPr>
+          <w:sz w:val="22"/>
+          <w:szCs w:val="22"/>
+        </w:rPr>
+        <w:t>Abrir la terminal o consola.</w:t>
+      </w:r>
+    </w:p>
+    <w:p>
+      <w:pPr>
+        <w:pStyle w:val="Prrafodelista"/>
+        <w:numPr>
+          <w:ilvl w:val="1"/>
+          <w:numId w:val="20"/>
+        </w:numPr>
+        <w:spacing w:before="240" w:after="0"/>
+        <w:rPr>
+          <w:sz w:val="22"/>
+          <w:szCs w:val="22"/>
+        </w:rPr>
+      </w:pPr>
+      <w:r>
+        <w:rPr>
+          <w:sz w:val="22"/>
+          <w:szCs w:val="22"/>
+        </w:rPr>
+        <w:t>Presione tecla Windows</w:t>
+      </w:r>
+    </w:p>
+    <w:p>
+      <w:pPr>
+        <w:pStyle w:val="Prrafodelista"/>
+        <w:numPr>
+          <w:ilvl w:val="1"/>
+          <w:numId w:val="20"/>
+        </w:numPr>
+        <w:spacing w:before="240" w:after="0"/>
+        <w:rPr>
+          <w:sz w:val="22"/>
+          <w:szCs w:val="22"/>
+        </w:rPr>
+      </w:pPr>
+      <w:r>
+        <w:rPr>
+          <w:sz w:val="22"/>
+          <w:szCs w:val="22"/>
+        </w:rPr>
+        <w:t>Escriba terminal</w:t>
+      </w:r>
+    </w:p>
+    <w:p>
+      <w:pPr>
+        <w:pStyle w:val="Prrafodelista"/>
+        <w:numPr>
+          <w:ilvl w:val="1"/>
+          <w:numId w:val="20"/>
+        </w:numPr>
+        <w:spacing w:before="240" w:after="0"/>
+        <w:rPr>
+          <w:sz w:val="22"/>
+          <w:szCs w:val="22"/>
+        </w:rPr>
+      </w:pPr>
+      <w:r>
+        <w:rPr>
+          <w:sz w:val="22"/>
+          <w:szCs w:val="22"/>
+        </w:rPr>
+        <w:lastRenderedPageBreak/>
+        <w:t>Seleccione la aplicación.</w:t>
+      </w:r>
+      <w:r>
+        <w:rPr>
+          <w:sz w:val="22"/>
+          <w:szCs w:val="22"/>
+        </w:rPr>
+        <w:br/>
+      </w:r>
+      <w:r>
+        <w:rPr>
+          <w:sz w:val="22"/>
+          <w:szCs w:val="22"/>
+        </w:rPr>
+        <w:drawing>
+          <wp:inline distT="0" distB="0" distL="0" distR="0" wp14:anchorId="206E72E7" wp14:editId="483ACF06">
+            <wp:extent cx="4016088" cy="2263336"/>
+            <wp:effectExtent l="0" t="0" r="3810" b="3810"/>
+            <wp:docPr id="1173813125" name="Imagen 1"/>
+            <wp:cNvGraphicFramePr>
+              <a:graphicFrameLocks xmlns:a="http://schemas.openxmlformats.org/drawingml/2006/main" noChangeAspect="1"/>
+            </wp:cNvGraphicFramePr>
+            <a:graphic xmlns:a="http://schemas.openxmlformats.org/drawingml/2006/main">
+              <a:graphicData uri="http://schemas.openxmlformats.org/drawingml/2006/picture">
+                <pic:pic xmlns:pic="http://schemas.openxmlformats.org/drawingml/2006/picture">
+                  <pic:nvPicPr>
+                    <pic:cNvPr id="1173813125" name=""/>
+                    <pic:cNvPicPr/>
+                  </pic:nvPicPr>
+                  <pic:blipFill>
+                    <a:blip r:embed="rId14"/>
+                    <a:stretch>
+                      <a:fillRect/>
+                    </a:stretch>
+                  </pic:blipFill>
+                  <pic:spPr>
+                    <a:xfrm>
+                      <a:off x="0" y="0"/>
+                      <a:ext cx="4016088" cy="2263336"/>
+                    </a:xfrm>
+                    <a:prstGeom prst="rect">
+                      <a:avLst/>
+                    </a:prstGeom>
+                  </pic:spPr>
+                </pic:pic>
+              </a:graphicData>
+            </a:graphic>
+          </wp:inline>
+        </w:drawing>
+      </w:r>
+    </w:p>
+    <w:p>
+      <w:pPr>
+        <w:pStyle w:val="Prrafodelista"/>
+        <w:numPr>
+          <w:ilvl w:val="0"/>
+          <w:numId w:val="20"/>
+        </w:numPr>
+        <w:spacing w:before="240" w:after="0"/>
+        <w:rPr>
+          <w:sz w:val="22"/>
+          <w:szCs w:val="22"/>
+        </w:rPr>
+      </w:pPr>
+      <w:r>
+        <w:rPr>
+          <w:sz w:val="22"/>
+          <w:szCs w:val="22"/>
+        </w:rPr>
+        <w:t xml:space="preserve">Moverse a </w:t>
+      </w:r>
+      <w:r>
+        <w:rPr>
+          <w:sz w:val="22"/>
+          <w:szCs w:val="22"/>
+        </w:rPr>
+        <w:t xml:space="preserve">escritorio utilizando </w:t>
+      </w:r>
+      <w:proofErr w:type="gramStart"/>
+      <w:r>
+        <w:rPr>
+          <w:i/>
+          <w:iCs/>
+          <w:sz w:val="22"/>
+          <w:szCs w:val="22"/>
+          <w:shd w:val="clear" w:color="auto" w:fill="E8E8E8" w:themeFill="background2"/>
+        </w:rPr>
+        <w:t>cd .</w:t>
+      </w:r>
+      <w:proofErr w:type="gramEnd"/>
+      <w:r>
+        <w:rPr>
+          <w:i/>
+          <w:iCs/>
+          <w:sz w:val="22"/>
+          <w:szCs w:val="22"/>
+          <w:shd w:val="clear" w:color="auto" w:fill="E8E8E8" w:themeFill="background2"/>
+        </w:rPr>
+        <w:t>\Desktop\</w:t>
+      </w:r>
+      <w:r>
+        <w:rPr>
+          <w:sz w:val="22"/>
+          <w:szCs w:val="22"/>
+        </w:rPr>
+        <w:t xml:space="preserve"> </w:t>
+      </w:r>
+      <w:r>
+        <w:rPr>
+          <w:sz w:val="22"/>
+          <w:szCs w:val="22"/>
+        </w:rPr>
+        <w:t xml:space="preserve">o </w:t>
+      </w:r>
+      <w:proofErr w:type="gramStart"/>
+      <w:r>
+        <w:rPr>
+          <w:i/>
+          <w:iCs/>
+          <w:sz w:val="22"/>
+          <w:szCs w:val="22"/>
+          <w:shd w:val="clear" w:color="auto" w:fill="E8E8E8" w:themeFill="background2"/>
+        </w:rPr>
+        <w:t>cd .</w:t>
+      </w:r>
+      <w:proofErr w:type="gramEnd"/>
+      <w:r>
+        <w:rPr>
+          <w:i/>
+          <w:iCs/>
+          <w:sz w:val="22"/>
+          <w:szCs w:val="22"/>
+          <w:shd w:val="clear" w:color="auto" w:fill="E8E8E8" w:themeFill="background2"/>
+        </w:rPr>
+        <w:t>\OneDrive\Desktop\</w:t>
+      </w:r>
+      <w:r>
+        <w:rPr>
+          <w:i/>
+          <w:iCs/>
+          <w:sz w:val="22"/>
+          <w:szCs w:val="22"/>
+          <w:shd w:val="clear" w:color="auto" w:fill="E8E8E8" w:themeFill="background2"/>
+        </w:rPr>
+        <w:br/>
+      </w:r>
+      <w:r>
+        <w:rPr>
+          <w:sz w:val="22"/>
+          <w:szCs w:val="22"/>
+        </w:rPr>
+        <w:drawing>
+          <wp:inline distT="0" distB="0" distL="0" distR="0" wp14:anchorId="207DAC21" wp14:editId="5AF1E8DA">
+            <wp:extent cx="5672667" cy="2916333"/>
+            <wp:effectExtent l="0" t="0" r="4445" b="0"/>
+            <wp:docPr id="1073386193" name="Imagen 1"/>
+            <wp:cNvGraphicFramePr>
+              <a:graphicFrameLocks xmlns:a="http://schemas.openxmlformats.org/drawingml/2006/main" noChangeAspect="1"/>
+            </wp:cNvGraphicFramePr>
+            <a:graphic xmlns:a="http://schemas.openxmlformats.org/drawingml/2006/main">
+              <a:graphicData uri="http://schemas.openxmlformats.org/drawingml/2006/picture">
+                <pic:pic xmlns:pic="http://schemas.openxmlformats.org/drawingml/2006/picture">
+                  <pic:nvPicPr>
+                    <pic:cNvPr id="1073386193" name=""/>
+                    <pic:cNvPicPr/>
+                  </pic:nvPicPr>
+                  <pic:blipFill>
+                    <a:blip r:embed="rId15"/>
+                    <a:stretch>
+                      <a:fillRect/>
+                    </a:stretch>
+                  </pic:blipFill>
+                  <pic:spPr>
+                    <a:xfrm>
+                      <a:off x="0" y="0"/>
+                      <a:ext cx="5691292" cy="2925908"/>
+                    </a:xfrm>
+                    <a:prstGeom prst="rect">
+                      <a:avLst/>
+                    </a:prstGeom>
+                  </pic:spPr>
+                </pic:pic>
+              </a:graphicData>
+            </a:graphic>
+          </wp:inline>
+        </w:drawing>
+      </w:r>
+    </w:p>
+    <w:p>
+      <w:pPr>
+        <w:pStyle w:val="Prrafodelista"/>
+        <w:numPr>
+          <w:ilvl w:val="0"/>
+          <w:numId w:val="20"/>
+        </w:numPr>
+        <w:spacing w:before="240" w:after="0"/>
+        <w:rPr>
+          <w:sz w:val="22"/>
+          <w:szCs w:val="22"/>
+        </w:rPr>
+      </w:pPr>
+      <w:r>
+        <w:rPr>
+          <w:sz w:val="22"/>
+          <w:szCs w:val="22"/>
+        </w:rPr>
+        <w:t>Clona el repositorio usando</w:t>
+      </w:r>
+      <w:r>
+        <w:rPr>
+          <w:sz w:val="22"/>
+          <w:szCs w:val="22"/>
+        </w:rPr>
+        <w:t xml:space="preserve"> (debe remplazar</w:t>
+      </w:r>
+      <w:r>
+        <w:t xml:space="preserve"> </w:t>
+      </w:r>
+      <w:r>
+        <w:rPr>
+          <w:sz w:val="22"/>
+          <w:szCs w:val="22"/>
+        </w:rPr>
+        <w:t>URL_DEL_REPOSITORIO</w:t>
+      </w:r>
+      <w:r>
+        <w:rPr>
+          <w:sz w:val="22"/>
+          <w:szCs w:val="22"/>
+        </w:rPr>
+        <w:t xml:space="preserve"> </w:t>
+      </w:r>
+      <w:r>
+        <w:rPr>
+          <w:sz w:val="22"/>
+          <w:szCs w:val="22"/>
+        </w:rPr>
+        <w:t xml:space="preserve">con la </w:t>
+      </w:r>
+      <w:proofErr w:type="spellStart"/>
+      <w:r>
+        <w:rPr>
+          <w:sz w:val="22"/>
+          <w:szCs w:val="22"/>
+        </w:rPr>
+        <w:t>url</w:t>
+      </w:r>
+      <w:proofErr w:type="spellEnd"/>
+      <w:r>
+        <w:rPr>
+          <w:sz w:val="22"/>
+          <w:szCs w:val="22"/>
+        </w:rPr>
+        <w:t xml:space="preserve"> de su repositorio):</w:t>
+      </w:r>
+      <w:r>
+        <w:rPr>
+          <w:sz w:val="22"/>
+          <w:szCs w:val="22"/>
+        </w:rPr>
+        <w:t xml:space="preserve"> </w:t>
+      </w:r>
+      <w:proofErr w:type="spellStart"/>
+      <w:r>
+        <w:rPr>
+          <w:i/>
+          <w:iCs/>
+          <w:sz w:val="22"/>
+          <w:szCs w:val="22"/>
+          <w:highlight w:val="lightGray"/>
+        </w:rPr>
+        <w:t>git</w:t>
+      </w:r>
+      <w:proofErr w:type="spellEnd"/>
+      <w:r>
+        <w:rPr>
+          <w:i/>
+          <w:iCs/>
+          <w:sz w:val="22"/>
+          <w:szCs w:val="22"/>
+          <w:highlight w:val="lightGray"/>
+        </w:rPr>
+        <w:t xml:space="preserve"> clone URL_DEL_REPOSITORIO</w:t>
+      </w:r>
+    </w:p>
+    <w:p>
+      <w:pPr>
+        <w:pStyle w:val="Prrafodelista"/>
+        <w:numPr>
+          <w:ilvl w:val="0"/>
+          <w:numId w:val="20"/>
+        </w:numPr>
+        <w:spacing w:before="240" w:after="0"/>
+        <w:rPr>
+          <w:sz w:val="22"/>
+          <w:szCs w:val="22"/>
+        </w:rPr>
+      </w:pPr>
+      <w:r>
+        <w:rPr>
+          <w:sz w:val="22"/>
+          <w:szCs w:val="22"/>
+        </w:rPr>
+        <w:t xml:space="preserve">Presione </w:t>
+      </w:r>
+      <w:proofErr w:type="spellStart"/>
+      <w:r>
+        <w:rPr>
+          <w:sz w:val="22"/>
+          <w:szCs w:val="22"/>
+        </w:rPr>
+        <w:t>enter</w:t>
+      </w:r>
+      <w:proofErr w:type="spellEnd"/>
+      <w:r>
+        <w:rPr>
+          <w:sz w:val="22"/>
+          <w:szCs w:val="22"/>
+        </w:rPr>
+        <w:t>.</w:t>
+      </w:r>
+      <w:r>
+        <w:rPr>
+          <w:sz w:val="22"/>
+          <w:szCs w:val="22"/>
+        </w:rPr>
+        <w:br/>
+      </w:r>
+      <w:r>
+        <w:rPr>
+          <w:sz w:val="22"/>
+          <w:szCs w:val="22"/>
+        </w:rPr>
+        <w:drawing>
+          <wp:inline distT="0" distB="0" distL="0" distR="0" wp14:anchorId="0246EE02" wp14:editId="21E5DA1D">
+            <wp:extent cx="3851564" cy="1980099"/>
+            <wp:effectExtent l="0" t="0" r="0" b="1270"/>
+            <wp:docPr id="1024315479" name="Imagen 1"/>
+            <wp:cNvGraphicFramePr>
+              <a:graphicFrameLocks xmlns:a="http://schemas.openxmlformats.org/drawingml/2006/main" noChangeAspect="1"/>
+            </wp:cNvGraphicFramePr>
+            <a:graphic xmlns:a="http://schemas.openxmlformats.org/drawingml/2006/main">
+              <a:graphicData uri="http://schemas.openxmlformats.org/drawingml/2006/picture">
+                <pic:pic xmlns:pic="http://schemas.openxmlformats.org/drawingml/2006/picture">
+                  <pic:nvPicPr>
+                    <pic:cNvPr id="1024315479" name=""/>
+                    <pic:cNvPicPr/>
+                  </pic:nvPicPr>
+                  <pic:blipFill>
+                    <a:blip r:embed="rId16"/>
+                    <a:stretch>
+                      <a:fillRect/>
+                    </a:stretch>
+                  </pic:blipFill>
+                  <pic:spPr>
+                    <a:xfrm>
+                      <a:off x="0" y="0"/>
+                      <a:ext cx="3883300" cy="1996414"/>
+                    </a:xfrm>
+                    <a:prstGeom prst="rect">
+                      <a:avLst/>
+                    </a:prstGeom>
+                  </pic:spPr>
+                </pic:pic>
+              </a:graphicData>
+            </a:graphic>
+          </wp:inline>
+        </w:drawing>
+      </w:r>
+    </w:p>
+    <w:p>
+      <w:pPr>
+        <w:spacing w:before="240" w:after="0"/>
+        <w:rPr>
+          <w:sz w:val="22"/>
+          <w:szCs w:val="22"/>
+        </w:rPr>
+      </w:pPr>
+      <w:r>
+        <w:rPr>
+          <w:b/>
+          <w:bCs/>
+          <w:sz w:val="22"/>
+          <w:szCs w:val="22"/>
+        </w:rPr>
+        <w:lastRenderedPageBreak/>
         <w:t>Parte 1 — Preparación del entorno</w:t>
       </w:r>
     </w:p>
@@ -401,6 +1494,7 @@
       </w:pPr>
       <w:r>
         <w:rPr>
+          <w:noProof/>
           <w:sz w:val="22"/>
           <w:szCs w:val="22"/>
         </w:rPr>
@@ -420,7 +1514,7 @@
                     <pic:cNvPicPr/>
                   </pic:nvPicPr>
                   <pic:blipFill>
-                    <a:blip r:embed="rId7"/>
+                    <a:blip r:embed="rId17"/>
                     <a:stretch>
                       <a:fillRect/>
                     </a:stretch>
@@ -486,7 +1580,6 @@
           <w:sz w:val="22"/>
           <w:szCs w:val="22"/>
         </w:rPr>
-        <w:lastRenderedPageBreak/>
         <w:t>Abra</w:t>
       </w:r>
       <w:r>
@@ -533,6 +1626,7 @@
       </w:r>
       <w:r>
         <w:rPr>
+          <w:noProof/>
           <w:sz w:val="22"/>
           <w:szCs w:val="22"/>
         </w:rPr>
@@ -552,7 +1646,7 @@
                     <pic:cNvPicPr/>
                   </pic:nvPicPr>
                   <pic:blipFill>
-                    <a:blip r:embed="rId8"/>
+                    <a:blip r:embed="rId18"/>
                     <a:stretch>
                       <a:fillRect/>
                     </a:stretch>
@@ -633,6 +1727,7 @@
       </w:r>
       <w:r>
         <w:rPr>
+          <w:noProof/>
           <w:sz w:val="22"/>
           <w:szCs w:val="22"/>
         </w:rPr>
@@ -652,7 +1747,7 @@
                     <pic:cNvPicPr/>
                   </pic:nvPicPr>
                   <pic:blipFill>
-                    <a:blip r:embed="rId9"/>
+                    <a:blip r:embed="rId19"/>
                     <a:stretch>
                       <a:fillRect/>
                     </a:stretch>
@@ -694,6 +1789,7 @@
           <w:sz w:val="22"/>
           <w:szCs w:val="22"/>
         </w:rPr>
+        <w:lastRenderedPageBreak/>
         <w:t>Cree un nuevo folder llamado “</w:t>
       </w:r>
       <w:r>
@@ -726,6 +1822,7 @@
       </w:r>
       <w:r>
         <w:rPr>
+          <w:noProof/>
           <w:sz w:val="22"/>
           <w:szCs w:val="22"/>
         </w:rPr>
@@ -745,7 +1842,7 @@
                     <pic:cNvPicPr/>
                   </pic:nvPicPr>
                   <pic:blipFill>
-                    <a:blip r:embed="rId10"/>
+                    <a:blip r:embed="rId20"/>
                     <a:stretch>
                       <a:fillRect/>
                     </a:stretch>
@@ -840,6 +1937,7 @@
       </w:r>
       <w:r>
         <w:rPr>
+          <w:noProof/>
           <w:sz w:val="22"/>
           <w:szCs w:val="22"/>
         </w:rPr>
@@ -859,7 +1957,7 @@
                     <pic:cNvPicPr/>
                   </pic:nvPicPr>
                   <pic:blipFill>
-                    <a:blip r:embed="rId11"/>
+                    <a:blip r:embed="rId21"/>
                     <a:stretch>
                       <a:fillRect/>
                     </a:stretch>
@@ -897,7 +1995,6 @@
           <w:sz w:val="22"/>
           <w:szCs w:val="22"/>
         </w:rPr>
-        <w:lastRenderedPageBreak/>
         <w:t xml:space="preserve">Parte </w:t>
       </w:r>
       <w:r>
@@ -1231,6 +2328,9 @@
         <w:br/>
       </w:r>
       <w:r>
+        <w:rPr>
+          <w:noProof/>
+        </w:rPr>
         <w:drawing>
           <wp:inline distT="0" distB="0" distL="0" distR="0" wp14:anchorId="2141823B" wp14:editId="60C34B69">
             <wp:extent cx="2519885" cy="1653540"/>
@@ -1249,7 +2349,7 @@
                     </pic:cNvPicPr>
                   </pic:nvPicPr>
                   <pic:blipFill>
-                    <a:blip r:embed="rId12" cstate="print">
+                    <a:blip r:embed="rId22" cstate="print">
                       <a:extLst>
                         <a:ext uri="{28A0092B-C50C-407E-A947-70E740481C1C}">
                           <a14:useLocalDpi xmlns:a14="http://schemas.microsoft.com/office/drawing/2010/main" val="0"/>
@@ -1461,6 +2561,7 @@
           <w:sz w:val="22"/>
           <w:szCs w:val="22"/>
         </w:rPr>
+        <w:lastRenderedPageBreak/>
         <w:t>Sobrepeso (25 - 29.9)</w:t>
       </w:r>
     </w:p>
@@ -1696,6 +2797,7 @@
       </w:pPr>
       <w:r>
         <w:rPr>
+          <w:noProof/>
           <w:sz w:val="22"/>
           <w:szCs w:val="22"/>
         </w:rPr>
@@ -1715,7 +2817,7 @@
                     <pic:cNvPicPr/>
                   </pic:nvPicPr>
                   <pic:blipFill>
-                    <a:blip r:embed="rId13"/>
+                    <a:blip r:embed="rId23"/>
                     <a:stretch>
                       <a:fillRect/>
                     </a:stretch>
@@ -1753,7 +2855,6 @@
           <w:sz w:val="22"/>
           <w:szCs w:val="22"/>
         </w:rPr>
-        <w:lastRenderedPageBreak/>
         <w:t>Ejemplo de ejecución:</w:t>
       </w:r>
     </w:p>
@@ -1771,6 +2872,7 @@
         <w:rPr>
           <w:b/>
           <w:bCs/>
+          <w:noProof/>
           <w:sz w:val="22"/>
           <w:szCs w:val="22"/>
         </w:rPr>
@@ -1790,7 +2892,7 @@
                     <pic:cNvPicPr/>
                   </pic:nvPicPr>
                   <pic:blipFill>
-                    <a:blip r:embed="rId14"/>
+                    <a:blip r:embed="rId24"/>
                     <a:stretch>
                       <a:fillRect/>
                     </a:stretch>
@@ -1885,6 +2987,7 @@
           <w:sz w:val="22"/>
           <w:szCs w:val="22"/>
         </w:rPr>
+        <w:lastRenderedPageBreak/>
         <w:t>Debe abrir una terminal (View -&gt; Terminal).</w:t>
       </w:r>
       <w:r>
@@ -1896,6 +2999,7 @@
       </w:r>
       <w:r>
         <w:rPr>
+          <w:noProof/>
           <w:sz w:val="22"/>
           <w:szCs w:val="22"/>
         </w:rPr>
@@ -1915,7 +3019,7 @@
                     <pic:cNvPicPr/>
                   </pic:nvPicPr>
                   <pic:blipFill>
-                    <a:blip r:embed="rId15"/>
+                    <a:blip r:embed="rId25"/>
                     <a:stretch>
                       <a:fillRect/>
                     </a:stretch>
@@ -2008,6 +3112,7 @@
         <w:rPr>
           <w:sz w:val="22"/>
           <w:szCs w:val="22"/>
+          <w:lang w:val="en-US"/>
         </w:rPr>
       </w:pPr>
       <w:r>
@@ -2017,10 +3122,12 @@
           <w:sz w:val="22"/>
           <w:szCs w:val="22"/>
           <w:highlight w:val="lightGray"/>
-        </w:rPr>
-        <w:lastRenderedPageBreak/>
-        <w:t xml:space="preserve">git config --global user.email </w:t>
-      </w:r>
+          <w:lang w:val="en-US"/>
+        </w:rPr>
+        <w:t xml:space="preserve">git config --global </w:t>
+      </w:r>
+      <w:proofErr w:type="spellStart"/>
+      <w:proofErr w:type="gramStart"/>
       <w:r>
         <w:rPr>
           <w:i/>
@@ -2028,10 +3135,35 @@
           <w:sz w:val="22"/>
           <w:szCs w:val="22"/>
           <w:highlight w:val="lightGray"/>
+          <w:lang w:val="en-US"/>
+        </w:rPr>
+        <w:t>user.email</w:t>
+      </w:r>
+      <w:proofErr w:type="spellEnd"/>
+      <w:proofErr w:type="gramEnd"/>
+      <w:r>
+        <w:rPr>
+          <w:i/>
+          <w:iCs/>
+          <w:sz w:val="22"/>
+          <w:szCs w:val="22"/>
+          <w:highlight w:val="lightGray"/>
+          <w:lang w:val="en-US"/>
+        </w:rPr>
+        <w:t xml:space="preserve"> </w:t>
+      </w:r>
+      <w:r>
+        <w:rPr>
+          <w:i/>
+          <w:iCs/>
+          <w:sz w:val="22"/>
+          <w:szCs w:val="22"/>
+          <w:highlight w:val="lightGray"/>
+          <w:lang w:val="en-US"/>
         </w:rPr>
         <w:t>“</w:t>
       </w:r>
-      <w:hyperlink r:id="rId16" w:history="1">
+      <w:hyperlink r:id="rId26" w:history="1">
         <w:r>
           <w:rPr>
             <w:rStyle w:val="Hipervnculo"/>
@@ -2040,6 +3172,7 @@
             <w:sz w:val="22"/>
             <w:szCs w:val="22"/>
             <w:highlight w:val="lightGray"/>
+            <w:lang w:val="en-US"/>
           </w:rPr>
           <w:t>correo@ejemplo.com</w:t>
         </w:r>
@@ -2051,6 +3184,7 @@
           <w:sz w:val="22"/>
           <w:szCs w:val="22"/>
           <w:highlight w:val="lightGray"/>
+          <w:lang w:val="en-US"/>
         </w:rPr>
         <w:t>”</w:t>
       </w:r>
@@ -2058,11 +3192,13 @@
         <w:rPr>
           <w:sz w:val="22"/>
           <w:szCs w:val="22"/>
+          <w:lang w:val="en-US"/>
         </w:rPr>
         <w:br/>
       </w:r>
       <w:r>
         <w:rPr>
+          <w:noProof/>
           <w:sz w:val="22"/>
           <w:szCs w:val="22"/>
         </w:rPr>
@@ -2082,7 +3218,7 @@
                     <pic:cNvPicPr/>
                   </pic:nvPicPr>
                   <pic:blipFill>
-                    <a:blip r:embed="rId17"/>
+                    <a:blip r:embed="rId27"/>
                     <a:stretch>
                       <a:fillRect/>
                     </a:stretch>
@@ -2131,8 +3267,9 @@
           <w:szCs w:val="22"/>
           <w:highlight w:val="lightGray"/>
         </w:rPr>
-        <w:t>git add</w:t>
-      </w:r>
+        <w:t xml:space="preserve">git </w:t>
+      </w:r>
+      <w:proofErr w:type="gramStart"/>
       <w:r>
         <w:rPr>
           <w:i/>
@@ -2141,8 +3278,19 @@
           <w:szCs w:val="22"/>
           <w:highlight w:val="lightGray"/>
         </w:rPr>
+        <w:t>add</w:t>
+      </w:r>
+      <w:r>
+        <w:rPr>
+          <w:i/>
+          <w:iCs/>
+          <w:sz w:val="22"/>
+          <w:szCs w:val="22"/>
+          <w:highlight w:val="lightGray"/>
+        </w:rPr>
         <w:t xml:space="preserve"> .</w:t>
       </w:r>
+      <w:proofErr w:type="gramEnd"/>
     </w:p>
     <w:p>
       <w:pPr>
@@ -2280,25 +3428,11 @@
           <w:sz w:val="22"/>
           <w:szCs w:val="22"/>
         </w:rPr>
-        <w:t xml:space="preserve">, para enviar nuestros cambios al repositorio </w:t>
-      </w:r>
-      <w:r>
-        <w:rPr>
-          <w:sz w:val="22"/>
-          <w:szCs w:val="22"/>
-        </w:rPr>
-        <w:t>remoto (</w:t>
-      </w:r>
-      <w:r>
-        <w:rPr>
-          <w:sz w:val="22"/>
-          <w:szCs w:val="22"/>
-        </w:rPr>
-        <w:t>GitHub).</w:t>
+        <w:t>, para enviar nuestros cambios al repositorio remoto (GitHub).</w:t>
       </w:r>
     </w:p>
     <w:sectPr>
-      <w:headerReference w:type="default" r:id="rId18"/>
+      <w:headerReference w:type="default" r:id="rId28"/>
       <w:pgSz w:w="12240" w:h="15840"/>
       <w:pgMar w:top="1440" w:right="1440" w:bottom="1440" w:left="1440" w:header="720" w:footer="720" w:gutter="0"/>
       <w:cols w:space="720"/>
@@ -2365,6 +3499,9 @@
       <w:pStyle w:val="Encabezado"/>
     </w:pPr>
     <w:r>
+      <w:rPr>
+        <w:noProof/>
+      </w:rPr>
       <w:drawing>
         <wp:anchor distT="0" distB="0" distL="114300" distR="114300" simplePos="0" relativeHeight="251659264" behindDoc="1" locked="0" layoutInCell="1" allowOverlap="1" wp14:anchorId="526DB0BA" wp14:editId="088AE8A9">
           <wp:simplePos x="0" y="0"/>
@@ -2434,6 +3571,9 @@
       </w:drawing>
     </w:r>
     <w:r>
+      <w:rPr>
+        <w:noProof/>
+      </w:rPr>
       <w:drawing>
         <wp:anchor distT="0" distB="0" distL="114300" distR="114300" simplePos="0" relativeHeight="251658240" behindDoc="1" locked="0" layoutInCell="1" allowOverlap="1" wp14:anchorId="71B5F3C5" wp14:editId="001D90C5">
           <wp:simplePos x="0" y="0"/>
@@ -3636,6 +4776,95 @@
     </w:lvl>
   </w:abstractNum>
   <w:abstractNum w:abstractNumId="9" w15:restartNumberingAfterBreak="0">
+    <w:nsid w:val="2FC004A1"/>
+    <w:multiLevelType w:val="hybridMultilevel"/>
+    <w:tmpl w:val="513CFAB2"/>
+    <w:lvl w:ilvl="0" w:tplc="0409000F">
+      <w:start w:val="1"/>
+      <w:numFmt w:val="decimal"/>
+      <w:lvlText w:val="%1."/>
+      <w:lvlJc w:val="left"/>
+      <w:pPr>
+        <w:ind w:left="720" w:hanging="360"/>
+      </w:pPr>
+      <w:rPr>
+        <w:rFonts w:hint="default"/>
+      </w:rPr>
+    </w:lvl>
+    <w:lvl w:ilvl="1" w:tplc="04090019">
+      <w:start w:val="1"/>
+      <w:numFmt w:val="lowerLetter"/>
+      <w:lvlText w:val="%2."/>
+      <w:lvlJc w:val="left"/>
+      <w:pPr>
+        <w:ind w:left="1440" w:hanging="360"/>
+      </w:pPr>
+    </w:lvl>
+    <w:lvl w:ilvl="2" w:tplc="0409001B" w:tentative="1">
+      <w:start w:val="1"/>
+      <w:numFmt w:val="lowerRoman"/>
+      <w:lvlText w:val="%3."/>
+      <w:lvlJc w:val="right"/>
+      <w:pPr>
+        <w:ind w:left="2160" w:hanging="180"/>
+      </w:pPr>
+    </w:lvl>
+    <w:lvl w:ilvl="3" w:tplc="0409000F" w:tentative="1">
+      <w:start w:val="1"/>
+      <w:numFmt w:val="decimal"/>
+      <w:lvlText w:val="%4."/>
+      <w:lvlJc w:val="left"/>
+      <w:pPr>
+        <w:ind w:left="2880" w:hanging="360"/>
+      </w:pPr>
+    </w:lvl>
+    <w:lvl w:ilvl="4" w:tplc="04090019" w:tentative="1">
+      <w:start w:val="1"/>
+      <w:numFmt w:val="lowerLetter"/>
+      <w:lvlText w:val="%5."/>
+      <w:lvlJc w:val="left"/>
+      <w:pPr>
+        <w:ind w:left="3600" w:hanging="360"/>
+      </w:pPr>
+    </w:lvl>
+    <w:lvl w:ilvl="5" w:tplc="0409001B" w:tentative="1">
+      <w:start w:val="1"/>
+      <w:numFmt w:val="lowerRoman"/>
+      <w:lvlText w:val="%6."/>
+      <w:lvlJc w:val="right"/>
+      <w:pPr>
+        <w:ind w:left="4320" w:hanging="180"/>
+      </w:pPr>
+    </w:lvl>
+    <w:lvl w:ilvl="6" w:tplc="0409000F" w:tentative="1">
+      <w:start w:val="1"/>
+      <w:numFmt w:val="decimal"/>
+      <w:lvlText w:val="%7."/>
+      <w:lvlJc w:val="left"/>
+      <w:pPr>
+        <w:ind w:left="5040" w:hanging="360"/>
+      </w:pPr>
+    </w:lvl>
+    <w:lvl w:ilvl="7" w:tplc="04090019" w:tentative="1">
+      <w:start w:val="1"/>
+      <w:numFmt w:val="lowerLetter"/>
+      <w:lvlText w:val="%8."/>
+      <w:lvlJc w:val="left"/>
+      <w:pPr>
+        <w:ind w:left="5760" w:hanging="360"/>
+      </w:pPr>
+    </w:lvl>
+    <w:lvl w:ilvl="8" w:tplc="0409001B" w:tentative="1">
+      <w:start w:val="1"/>
+      <w:numFmt w:val="lowerRoman"/>
+      <w:lvlText w:val="%9."/>
+      <w:lvlJc w:val="right"/>
+      <w:pPr>
+        <w:ind w:left="6480" w:hanging="180"/>
+      </w:pPr>
+    </w:lvl>
+  </w:abstractNum>
+  <w:abstractNum w:abstractNumId="10" w15:restartNumberingAfterBreak="0">
     <w:nsid w:val="33DF40C7"/>
     <w:multiLevelType w:val="multilevel"/>
     <w:tmpl w:val="B002C87A"/>
@@ -3784,7 +5013,7 @@
       </w:rPr>
     </w:lvl>
   </w:abstractNum>
-  <w:abstractNum w:abstractNumId="10" w15:restartNumberingAfterBreak="0">
+  <w:abstractNum w:abstractNumId="11" w15:restartNumberingAfterBreak="0">
     <w:nsid w:val="362C78CD"/>
     <w:multiLevelType w:val="multilevel"/>
     <w:tmpl w:val="36DE580A"/>
@@ -3933,7 +5162,7 @@
       </w:rPr>
     </w:lvl>
   </w:abstractNum>
-  <w:abstractNum w:abstractNumId="11" w15:restartNumberingAfterBreak="0">
+  <w:abstractNum w:abstractNumId="12" w15:restartNumberingAfterBreak="0">
     <w:nsid w:val="369B0D6B"/>
     <w:multiLevelType w:val="multilevel"/>
     <w:tmpl w:val="D48EC682"/>
@@ -4082,7 +5311,7 @@
       </w:rPr>
     </w:lvl>
   </w:abstractNum>
-  <w:abstractNum w:abstractNumId="12" w15:restartNumberingAfterBreak="0">
+  <w:abstractNum w:abstractNumId="13" w15:restartNumberingAfterBreak="0">
     <w:nsid w:val="4C633A9D"/>
     <w:multiLevelType w:val="multilevel"/>
     <w:tmpl w:val="9022EEA8"/>
@@ -4231,7 +5460,7 @@
       </w:rPr>
     </w:lvl>
   </w:abstractNum>
-  <w:abstractNum w:abstractNumId="13" w15:restartNumberingAfterBreak="0">
+  <w:abstractNum w:abstractNumId="14" w15:restartNumberingAfterBreak="0">
     <w:nsid w:val="6B9C12C9"/>
     <w:multiLevelType w:val="multilevel"/>
     <w:tmpl w:val="B708498A"/>
@@ -4380,7 +5609,7 @@
       </w:rPr>
     </w:lvl>
   </w:abstractNum>
-  <w:abstractNum w:abstractNumId="14" w15:restartNumberingAfterBreak="0">
+  <w:abstractNum w:abstractNumId="15" w15:restartNumberingAfterBreak="0">
     <w:nsid w:val="700D609A"/>
     <w:multiLevelType w:val="multilevel"/>
     <w:tmpl w:val="5BD08D50"/>
@@ -4497,7 +5726,7 @@
       </w:pPr>
     </w:lvl>
   </w:abstractNum>
-  <w:abstractNum w:abstractNumId="15" w15:restartNumberingAfterBreak="0">
+  <w:abstractNum w:abstractNumId="16" w15:restartNumberingAfterBreak="0">
     <w:nsid w:val="702C09E1"/>
     <w:multiLevelType w:val="hybridMultilevel"/>
     <w:tmpl w:val="358499BC"/>
@@ -4637,7 +5866,7 @@
       </w:rPr>
     </w:lvl>
   </w:abstractNum>
-  <w:abstractNum w:abstractNumId="16" w15:restartNumberingAfterBreak="0">
+  <w:abstractNum w:abstractNumId="17" w15:restartNumberingAfterBreak="0">
     <w:nsid w:val="71A812D5"/>
     <w:multiLevelType w:val="multilevel"/>
     <w:tmpl w:val="4C001D8A"/>
@@ -4754,7 +5983,7 @@
       </w:pPr>
     </w:lvl>
   </w:abstractNum>
-  <w:abstractNum w:abstractNumId="17" w15:restartNumberingAfterBreak="0">
+  <w:abstractNum w:abstractNumId="18" w15:restartNumberingAfterBreak="0">
     <w:nsid w:val="7BDF7C2C"/>
     <w:multiLevelType w:val="multilevel"/>
     <w:tmpl w:val="F8CEB994"/>
@@ -4903,7 +6132,7 @@
       </w:rPr>
     </w:lvl>
   </w:abstractNum>
-  <w:abstractNum w:abstractNumId="18" w15:restartNumberingAfterBreak="0">
+  <w:abstractNum w:abstractNumId="19" w15:restartNumberingAfterBreak="0">
     <w:nsid w:val="7D6572A0"/>
     <w:multiLevelType w:val="multilevel"/>
     <w:tmpl w:val="6F56939A"/>
@@ -5023,13 +6252,13 @@
     <w:abstractNumId w:val="3"/>
   </w:num>
   <w:num w:numId="3" w16cid:durableId="2055150062">
-    <w:abstractNumId w:val="18"/>
+    <w:abstractNumId w:val="19"/>
   </w:num>
   <w:num w:numId="4" w16cid:durableId="1540317997">
-    <w:abstractNumId w:val="16"/>
+    <w:abstractNumId w:val="17"/>
   </w:num>
   <w:num w:numId="5" w16cid:durableId="1658606404">
-    <w:abstractNumId w:val="14"/>
+    <w:abstractNumId w:val="15"/>
   </w:num>
   <w:num w:numId="6" w16cid:durableId="1058625292">
     <w:abstractNumId w:val="7"/>
@@ -5041,25 +6270,25 @@
     <w:abstractNumId w:val="1"/>
   </w:num>
   <w:num w:numId="9" w16cid:durableId="161894924">
+    <w:abstractNumId w:val="12"/>
+  </w:num>
+  <w:num w:numId="10" w16cid:durableId="1304233538">
+    <w:abstractNumId w:val="14"/>
+  </w:num>
+  <w:num w:numId="11" w16cid:durableId="537936277">
+    <w:abstractNumId w:val="13"/>
+  </w:num>
+  <w:num w:numId="12" w16cid:durableId="1767649165">
     <w:abstractNumId w:val="11"/>
   </w:num>
-  <w:num w:numId="10" w16cid:durableId="1304233538">
-    <w:abstractNumId w:val="13"/>
-  </w:num>
-  <w:num w:numId="11" w16cid:durableId="537936277">
-    <w:abstractNumId w:val="12"/>
-  </w:num>
-  <w:num w:numId="12" w16cid:durableId="1767649165">
-    <w:abstractNumId w:val="10"/>
-  </w:num>
   <w:num w:numId="13" w16cid:durableId="140658606">
-    <w:abstractNumId w:val="17"/>
+    <w:abstractNumId w:val="18"/>
   </w:num>
   <w:num w:numId="14" w16cid:durableId="542908462">
     <w:abstractNumId w:val="6"/>
   </w:num>
   <w:num w:numId="15" w16cid:durableId="1024524510">
-    <w:abstractNumId w:val="9"/>
+    <w:abstractNumId w:val="10"/>
   </w:num>
   <w:num w:numId="16" w16cid:durableId="1868639274">
     <w:abstractNumId w:val="0"/>
@@ -5068,10 +6297,13 @@
     <w:abstractNumId w:val="5"/>
   </w:num>
   <w:num w:numId="18" w16cid:durableId="596134118">
-    <w:abstractNumId w:val="15"/>
+    <w:abstractNumId w:val="16"/>
   </w:num>
   <w:num w:numId="19" w16cid:durableId="224221170">
     <w:abstractNumId w:val="4"/>
+  </w:num>
+  <w:num w:numId="20" w16cid:durableId="1038314764">
+    <w:abstractNumId w:val="9"/>
   </w:num>
 </w:numbering>
 </file>
@@ -5682,7 +6914,6 @@
   <w:style w:type="character" w:default="1" w:styleId="Fuentedeprrafopredeter">
     <w:name w:val="Default Paragraph Font"/>
     <w:uiPriority w:val="1"/>
-    <w:semiHidden/>
     <w:unhideWhenUsed/>
   </w:style>
   <w:style w:type="table" w:default="1" w:styleId="Tablanormal">

</xml_diff>